<commit_message>
Corregir documentacion con diagramas SOLCA
</commit_message>
<xml_diff>
--- a/documentacion/documentacion_avance_solca_repositorio_clinico.docx
+++ b/documentacion/documentacion_avance_solca_repositorio_clinico.docx
@@ -43,7 +43,7 @@
         <w:br/>
       </w:r>
       <w:r>
-        <w:t>Sedes consideradas: SOLCA Cuenca, SOLCA Manabi y SOLCA Quito</w:t>
+        <w:t>Sedes consideradas: SOLCA Cuenca, SOLCA Manabi y SOLCA Guayaquil</w:t>
       </w:r>
     </w:p>
     <w:p/>
@@ -377,7 +377,7 @@
     </w:p>
     <w:p>
       <w:r>
-        <w:t>SOLCA Cuenca, Manabi y Quito atienden pacientes oncologicos que pueden requerir continuidad clinica entre sedes. El problema principal es la fragmentacion de informacion: datos demograficos, consultas, resultados de laboratorio e imagenologia pueden quedar distribuidos en sistemas locales, dificultando una vision regional del paciente.</w:t>
+        <w:t>SOLCA Cuenca, Manabi y Guayaquil atienden pacientes oncologicos que pueden requerir continuidad clinica entre sedes. El problema principal es la fragmentacion de informacion: datos demograficos, consultas, resultados de laboratorio e imagenologia pueden quedar distribuidos en sistemas locales, dificultando una vision regional del paciente.</w:t>
       </w:r>
     </w:p>
     <w:p>
@@ -3510,12 +3510,12 @@
         <w:pStyle w:val="Heading1"/>
       </w:pPr>
       <w:r>
-        <w:t>Anexo A. Diagramas de proceso institucional</w:t>
+        <w:t>Anexo A. Diagramas del Repositorio Clinico Regional</w:t>
       </w:r>
     </w:p>
     <w:p>
       <w:r>
-        <w:t>Los siguientes diagramas se utilizan como soporte metodologico para evidenciar el analisis de procesos hospitalarios relacionados con Imagenologia/PACS. El caso de adquisicion e implementacion de un tomografo permite vincular necesidades clinicas, departamentos participantes, riesgos operativos y habilitacion del servicio.</w:t>
+        <w:t>Los siguientes diagramas fueron elaborados a partir de la implementacion del proyecto. Representan la arquitectura cloud preliminar, la integracion REST del endpoint consolidado, el modelo de datos del Paciente Maestro Regional y los componentes cloud exigidos en los avances.</w:t>
       </w:r>
     </w:p>
     <w:tbl>
@@ -3541,7 +3541,7 @@
       <w:tr>
         <w:tc>
           <w:tcPr>
-            <w:tcW w:type="dxa" w:w="2100"/>
+            <w:tcW w:type="dxa" w:w="2600"/>
             <w:shd w:fill="F2F4F7"/>
             <w:vAlign w:val="center"/>
           </w:tcPr>
@@ -3562,7 +3562,7 @@
         </w:tc>
         <w:tc>
           <w:tcPr>
-            <w:tcW w:type="dxa" w:w="7260"/>
+            <w:tcW w:type="dxa" w:w="6760"/>
             <w:shd w:fill="F2F4F7"/>
             <w:vAlign w:val="center"/>
           </w:tcPr>
@@ -3585,7 +3585,7 @@
       <w:tr>
         <w:tc>
           <w:tcPr>
-            <w:tcW w:type="dxa" w:w="2100"/>
+            <w:tcW w:type="dxa" w:w="2600"/>
             <w:vAlign w:val="center"/>
           </w:tcPr>
           <w:p>
@@ -3598,13 +3598,13 @@
                 <w:b w:val="0"/>
                 <w:sz w:val="20"/>
               </w:rPr>
-              <w:t>SIPOC</w:t>
+              <w:t>Arquitectura cloud</w:t>
             </w:r>
           </w:p>
         </w:tc>
         <w:tc>
           <w:tcPr>
-            <w:tcW w:type="dxa" w:w="7260"/>
+            <w:tcW w:type="dxa" w:w="6760"/>
             <w:vAlign w:val="center"/>
           </w:tcPr>
           <w:p>
@@ -3617,7 +3617,7 @@
                 <w:b w:val="0"/>
                 <w:sz w:val="20"/>
               </w:rPr>
-              <w:t>Este SIPOC identifica proveedores, entradas, proceso, salidas y clientes. Sirve para justificar que Imagenologia no es un servicio aislado, sino un flujo institucional que requiere integracion tecnica, financiera, normativa y clinica.</w:t>
+              <w:t>Explica como Angular, JWT, microservicios Spring Boot, PostgreSQL y storage cloud se relacionan en una plataforma PaaS.</w:t>
             </w:r>
           </w:p>
         </w:tc>
@@ -3625,7 +3625,7 @@
       <w:tr>
         <w:tc>
           <w:tcPr>
-            <w:tcW w:type="dxa" w:w="2100"/>
+            <w:tcW w:type="dxa" w:w="2600"/>
             <w:vAlign w:val="center"/>
           </w:tcPr>
           <w:p>
@@ -3638,13 +3638,13 @@
                 <w:b w:val="0"/>
                 <w:sz w:val="20"/>
               </w:rPr>
-              <w:t>Mapa de procesos</w:t>
+              <w:t>Integracion REST</w:t>
             </w:r>
           </w:p>
         </w:tc>
         <w:tc>
           <w:tcPr>
-            <w:tcW w:type="dxa" w:w="7260"/>
+            <w:tcW w:type="dxa" w:w="6760"/>
             <w:vAlign w:val="center"/>
           </w:tcPr>
           <w:p>
@@ -3657,7 +3657,7 @@
                 <w:b w:val="0"/>
                 <w:sz w:val="20"/>
               </w:rPr>
-              <w:t>El mapa de procesos diferencia actividades estrategicas, misionales y de apoyo. Para el proyecto, refuerza la necesidad de un repositorio regional que permita consultar informacion clinica generada por servicios como Imagenologia.</w:t>
+              <w:t>Muestra el flujo obligatorio GET /repositorio/paciente/{idPacienteRegional} y las llamadas a los microservicios.</w:t>
             </w:r>
           </w:p>
         </w:tc>
@@ -3665,7 +3665,7 @@
       <w:tr>
         <w:tc>
           <w:tcPr>
-            <w:tcW w:type="dxa" w:w="2100"/>
+            <w:tcW w:type="dxa" w:w="2600"/>
             <w:vAlign w:val="center"/>
           </w:tcPr>
           <w:p>
@@ -3678,13 +3678,13 @@
                 <w:b w:val="0"/>
                 <w:sz w:val="20"/>
               </w:rPr>
-              <w:t>Flujo detallado</w:t>
+              <w:t>Modelo de datos</w:t>
             </w:r>
           </w:p>
         </w:tc>
         <w:tc>
           <w:tcPr>
-            <w:tcW w:type="dxa" w:w="7260"/>
+            <w:tcW w:type="dxa" w:w="6760"/>
             <w:vAlign w:val="center"/>
           </w:tcPr>
           <w:p>
@@ -3697,7 +3697,47 @@
                 <w:b w:val="0"/>
                 <w:sz w:val="20"/>
               </w:rPr>
-              <w:t>El flujo detalla aprobacion, compras, infraestructura, instalacion, pruebas, capacitacion y puesta en marcha. Sus puntos de decision ayudan a identificar riesgos de integracion, retrasos y fallas de configuracion.</w:t>
+              <w:t>Presenta el Paciente Maestro Regional y la independencia de bases de datos por dominio clinico.</w:t>
+            </w:r>
+          </w:p>
+        </w:tc>
+      </w:tr>
+      <w:tr>
+        <w:tc>
+          <w:tcPr>
+            <w:tcW w:type="dxa" w:w="2600"/>
+            <w:vAlign w:val="center"/>
+          </w:tcPr>
+          <w:p>
+            <w:pPr>
+              <w:jc w:val="left"/>
+            </w:pPr>
+            <w:r/>
+            <w:r>
+              <w:rPr>
+                <w:b w:val="0"/>
+                <w:sz w:val="20"/>
+              </w:rPr>
+              <w:t>Componentes cloud</w:t>
+            </w:r>
+          </w:p>
+        </w:tc>
+        <w:tc>
+          <w:tcPr>
+            <w:tcW w:type="dxa" w:w="6760"/>
+            <w:vAlign w:val="center"/>
+          </w:tcPr>
+          <w:p>
+            <w:pPr>
+              <w:jc w:val="left"/>
+            </w:pPr>
+            <w:r/>
+            <w:r>
+              <w:rPr>
+                <w:b w:val="0"/>
+                <w:sz w:val="20"/>
+              </w:rPr>
+              <w:t>Identifica IaaS, PaaS, SaaS, DBaaS y storage cloud como pide el enunciado.</w:t>
             </w:r>
           </w:p>
         </w:tc>
@@ -3719,7 +3759,7 @@
         <w:rPr>
           <w:b/>
         </w:rPr>
-        <w:t>Figura 1. SIPOC de adquisicion e implementacion de tomografo hospitalario.</w:t>
+        <w:t>Figura 1. Arquitectura cloud preliminar del Repositorio Clinico Regional SOLCA.</w:t>
       </w:r>
     </w:p>
     <w:p>
@@ -3729,7 +3769,7 @@
       <w:r>
         <w:drawing>
           <wp:inline xmlns:a="http://schemas.openxmlformats.org/drawingml/2006/main" xmlns:pic="http://schemas.openxmlformats.org/drawingml/2006/picture">
-            <wp:extent cx="8275320" cy="5855441"/>
+            <wp:extent cx="8641080" cy="5040630"/>
             <wp:docPr id="1" name="Picture 1"/>
             <wp:cNvGraphicFramePr>
               <a:graphicFrameLocks noChangeAspect="1"/>
@@ -3738,7 +3778,7 @@
               <a:graphicData uri="http://schemas.openxmlformats.org/drawingml/2006/picture">
                 <pic:pic>
                   <pic:nvPicPr>
-                    <pic:cNvPr id="0" name="ChatGPT Image 3 jul 2026, 15_14_28.png"/>
+                    <pic:cNvPr id="0" name="diagrama_arquitectura_cloud_solca.png"/>
                     <pic:cNvPicPr/>
                   </pic:nvPicPr>
                   <pic:blipFill>
@@ -3750,7 +3790,7 @@
                   <pic:spPr>
                     <a:xfrm>
                       <a:off x="0" y="0"/>
-                      <a:ext cx="8275320" cy="5855441"/>
+                      <a:ext cx="8641080" cy="5040630"/>
                     </a:xfrm>
                     <a:prstGeom prst="rect"/>
                   </pic:spPr>
@@ -3776,7 +3816,7 @@
         <w:rPr>
           <w:b/>
         </w:rPr>
-        <w:t>Figura 2. Mapa de procesos estrategicos, misionales y de apoyo para la adquisicion del tomografo.</w:t>
+        <w:t>Figura 2. Integracion REST para el endpoint consolidado del repositorio.</w:t>
       </w:r>
     </w:p>
     <w:p>
@@ -3786,7 +3826,7 @@
       <w:r>
         <w:drawing>
           <wp:inline xmlns:a="http://schemas.openxmlformats.org/drawingml/2006/main" xmlns:pic="http://schemas.openxmlformats.org/drawingml/2006/picture">
-            <wp:extent cx="8275320" cy="5855441"/>
+            <wp:extent cx="8641080" cy="5040630"/>
             <wp:docPr id="2" name="Picture 2"/>
             <wp:cNvGraphicFramePr>
               <a:graphicFrameLocks noChangeAspect="1"/>
@@ -3795,7 +3835,7 @@
               <a:graphicData uri="http://schemas.openxmlformats.org/drawingml/2006/picture">
                 <pic:pic>
                   <pic:nvPicPr>
-                    <pic:cNvPr id="0" name="ChatGPT Image 3 jul 2026, 15_13_41 (1).png"/>
+                    <pic:cNvPr id="0" name="diagrama_integracion_rest_solca.png"/>
                     <pic:cNvPicPr/>
                   </pic:nvPicPr>
                   <pic:blipFill>
@@ -3807,7 +3847,7 @@
                   <pic:spPr>
                     <a:xfrm>
                       <a:off x="0" y="0"/>
-                      <a:ext cx="8275320" cy="5855441"/>
+                      <a:ext cx="8641080" cy="5040630"/>
                     </a:xfrm>
                     <a:prstGeom prst="rect"/>
                   </pic:spPr>
@@ -3833,7 +3873,7 @@
         <w:rPr>
           <w:b/>
         </w:rPr>
-        <w:t>Figura 3. Flujo detallado del proceso de adquisicion e implementacion del tomografo.</w:t>
+        <w:t>Figura 3. Modelo de datos del Paciente Maestro Regional y bases independientes.</w:t>
       </w:r>
     </w:p>
     <w:p>
@@ -3843,7 +3883,7 @@
       <w:r>
         <w:drawing>
           <wp:inline xmlns:a="http://schemas.openxmlformats.org/drawingml/2006/main" xmlns:pic="http://schemas.openxmlformats.org/drawingml/2006/picture">
-            <wp:extent cx="8275320" cy="5855441"/>
+            <wp:extent cx="8641080" cy="5040630"/>
             <wp:docPr id="3" name="Picture 3"/>
             <wp:cNvGraphicFramePr>
               <a:graphicFrameLocks noChangeAspect="1"/>
@@ -3852,7 +3892,7 @@
               <a:graphicData uri="http://schemas.openxmlformats.org/drawingml/2006/picture">
                 <pic:pic>
                   <pic:nvPicPr>
-                    <pic:cNvPr id="0" name="ChatGPT Image 3 jul 2026, 15_14_40.png"/>
+                    <pic:cNvPr id="0" name="diagrama_modelo_datos_solca.png"/>
                     <pic:cNvPicPr/>
                   </pic:nvPicPr>
                   <pic:blipFill>
@@ -3864,7 +3904,64 @@
                   <pic:spPr>
                     <a:xfrm>
                       <a:off x="0" y="0"/>
-                      <a:ext cx="8275320" cy="5855441"/>
+                      <a:ext cx="8641080" cy="5040630"/>
+                    </a:xfrm>
+                    <a:prstGeom prst="rect"/>
+                  </pic:spPr>
+                </pic:pic>
+              </a:graphicData>
+            </a:graphic>
+          </wp:inline>
+        </w:drawing>
+      </w:r>
+    </w:p>
+    <w:p>
+      <w:pPr>
+        <w:sectPr>
+          <w:pgSz w:w="15840" w:h="12240" w:orient="landscape"/>
+          <w:pgMar w:top="720" w:right="792" w:bottom="720" w:left="792" w:header="708" w:footer="708" w:gutter="0"/>
+          <w:cols w:space="720"/>
+          <w:docGrid w:linePitch="360"/>
+        </w:sectPr>
+      </w:pPr>
+    </w:p>
+    <w:p>
+      <w:r>
+        <w:rPr>
+          <w:b/>
+        </w:rPr>
+        <w:t>Figura 4. Componentes cloud IaaS, PaaS, SaaS, DBaaS y storage cloud.</w:t>
+      </w:r>
+    </w:p>
+    <w:p>
+      <w:pPr>
+        <w:jc w:val="center"/>
+      </w:pPr>
+      <w:r>
+        <w:drawing>
+          <wp:inline xmlns:a="http://schemas.openxmlformats.org/drawingml/2006/main" xmlns:pic="http://schemas.openxmlformats.org/drawingml/2006/picture">
+            <wp:extent cx="8641080" cy="5040630"/>
+            <wp:docPr id="4" name="Picture 4"/>
+            <wp:cNvGraphicFramePr>
+              <a:graphicFrameLocks noChangeAspect="1"/>
+            </wp:cNvGraphicFramePr>
+            <a:graphic>
+              <a:graphicData uri="http://schemas.openxmlformats.org/drawingml/2006/picture">
+                <pic:pic>
+                  <pic:nvPicPr>
+                    <pic:cNvPr id="0" name="diagrama_componentes_cloud_solca.png"/>
+                    <pic:cNvPicPr/>
+                  </pic:nvPicPr>
+                  <pic:blipFill>
+                    <a:blip r:embed="rId13"/>
+                    <a:stretch>
+                      <a:fillRect/>
+                    </a:stretch>
+                  </pic:blipFill>
+                  <pic:spPr>
+                    <a:xfrm>
+                      <a:off x="0" y="0"/>
+                      <a:ext cx="8641080" cy="5040630"/>
                     </a:xfrm>
                     <a:prstGeom prst="rect"/>
                   </pic:spPr>

</xml_diff>